<commit_message>
Minor edit to the DOCX write-up
⬆️
</commit_message>
<xml_diff>
--- a/BioWatch Brief.docx
+++ b/BioWatch Brief.docx
@@ -144,13 +144,7 @@
         <w:t xml:space="preserve"> </w:t>
       </w:r>
       <w:r>
-        <w:t>This hackathon project is limited by available sources and infectious-disease expertise. BioWatch Brief relies on the underlying model's training knowledge for pathogen characterisation; for novel or poorly-documented agents, this knowledge may be incomplete, outdated, or absent — a gap partially mitigated by the uncertainty flag system but not eliminated by it. The tool cannot access live data sources autonomously: it assesses only what is present in the pasted text, meaning an analyst who pastes an incomplete or poorly-translated report will receive an assessment of correspondingly limited fidelity. It is also worth noting that the risk rubric, while grounded in established biosecurity frameworks, was developed and refined over a single weekend by a small team without formal epidemiological training</w:t>
-      </w:r>
-      <w:r>
-        <w:t xml:space="preserve"> </w:t>
-      </w:r>
-      <w:r>
-        <w:t>(although one member of the group is a board-certified clinical pathologist); edge cases and systematic biases likely remain.</w:t>
+        <w:t>This hackathon project is limited by available sources and infectious-disease expertise. BioWatch Brief relies on the underlying model's training knowledge for pathogen characterisation; for novel or poorly-documented agents, this knowledge may be incomplete, outdated, or absent — a gap partially mitigated by the uncertainty flag system but not eliminated by it. The tool cannot access live data sources autonomously: it assesses only what is present in the pasted text, meaning an analyst who pastes an incomplete or poorly-translated report will receive an assessment of correspondingly limited fidelity. It is also worth noting that the risk rubric, while grounded in established biosecurity frameworks, was developed and refined over a single weekend by a small team without formal epidemiological training (although one member of the group is a board-certified clinical pathologist); edge cases and systematic biases likely remain.</w:t>
       </w:r>
     </w:p>
     <w:p>
@@ -181,7 +175,13 @@
         <w:t>The work we have done in the past 72 hours</w:t>
       </w:r>
       <w:r>
-        <w:t xml:space="preserve">  </w:t>
+        <w:t xml:space="preserve"> </w:t>
+      </w:r>
+      <w:r>
+        <w:t xml:space="preserve">is highly pertinent to responding to the next great biological threat, the Disease X that may kill millions or sicken hundreds of millions. It spares the clinician, public health professional or scientist the need to trawl through voluminous primary sources, or at least gives him/her a head start on the preceding (by rapidly providing an executive summary of the information out there on the Web). With … </w:t>
+      </w:r>
+      <w:r>
+        <w:t xml:space="preserve"> </w:t>
       </w:r>
       <w:r>
         <w:rPr>

</xml_diff>